<commit_message>
fix: Corrección de error en nombre del sistema
</commit_message>
<xml_diff>
--- a/TI.1.2. PAO202651_SOAP_DOTNET_SINBDD_NRC36884_GR07/01. UML/01. ERS/ERS_SOAP_DOTNET_SINBDD_GR07.docx
+++ b/TI.1.2. PAO202651_SOAP_DOTNET_SINBDD_NRC36884_GR07/01. UML/01. ERS/ERS_SOAP_DOTNET_SINBDD_GR07.docx
@@ -9799,57 +9799,7 @@
                   </w14:solidFill>
                 </w14:textFill>
               </w:rPr>
-              <w:t>Entorno de desarrollo integrado creado por Microsoft. Fue creado principalmente para traba</w:t>
-            </w:r>
-            <w:bookmarkStart w:id="137" w:name="_GoBack"/>
-            <w:r>
-              <w:rPr>
-                <w:rFonts w:ascii="Calibri" w:hAnsi="Calibri" w:eastAsia="Calibri" w:cs="Calibri"/>
-                <w:b w:val="0"/>
-                <w:bCs w:val="0"/>
-                <w:i w:val="0"/>
-                <w:iCs w:val="0"/>
-                <w:caps w:val="0"/>
-                <w:smallCaps w:val="0"/>
-                <w:color w:val="4F81BD" w:themeColor="accent1" w:themeTint="FF"/>
-                <w:sz w:val="22"/>
-                <w:szCs w:val="22"/>
-                <w:lang w:val="es-ES"/>
-                <w14:textFill>
-                  <w14:solidFill>
-                    <w14:schemeClr w14:val="accent1">
-                      <w14:lumMod w14:val="100000"/>
-                      <w14:lumOff w14:val="0"/>
-                    </w14:schemeClr>
-                  </w14:solidFill>
-                </w14:textFill>
-              </w:rPr>
-              <w:t>ja</w:t>
-            </w:r>
-            <w:bookmarkEnd w:id="137"/>
-            <w:r>
-              <w:rPr>
-                <w:rFonts w:ascii="Calibri" w:hAnsi="Calibri" w:eastAsia="Calibri" w:cs="Calibri"/>
-                <w:b w:val="0"/>
-                <w:bCs w:val="0"/>
-                <w:i w:val="0"/>
-                <w:iCs w:val="0"/>
-                <w:caps w:val="0"/>
-                <w:smallCaps w:val="0"/>
-                <w:color w:val="4F81BD" w:themeColor="accent1" w:themeTint="FF"/>
-                <w:sz w:val="22"/>
-                <w:szCs w:val="22"/>
-                <w:lang w:val="es-ES"/>
-                <w14:textFill>
-                  <w14:solidFill>
-                    <w14:schemeClr w14:val="accent1">
-                      <w14:lumMod w14:val="100000"/>
-                      <w14:lumOff w14:val="0"/>
-                    </w14:schemeClr>
-                  </w14:solidFill>
-                </w14:textFill>
-              </w:rPr>
-              <w:t>r con el entorno .NET, pero también soporta otros lenguajes. Permite crear varios tipos de aplicaciones.</w:t>
+              <w:t>Entorno de desarrollo integrado creado por Microsoft. Fue creado principalmente para trabajar con el entorno .NET, pero también soporta otros lenguajes. Permite crear varios tipos de aplicaciones.</w:t>
             </w:r>
           </w:p>
         </w:tc>
@@ -9994,8 +9944,8 @@
       <w:pPr>
         <w:pStyle w:val="63"/>
       </w:pPr>
-      <w:bookmarkStart w:id="24" w:name="_Toc83812945"/>
-      <w:bookmarkStart w:id="25" w:name="_Toc242174924"/>
+      <w:bookmarkStart w:id="24" w:name="_Toc242174924"/>
+      <w:bookmarkStart w:id="25" w:name="_Toc83812945"/>
       <w:r>
         <w:t xml:space="preserve">Tabla </w:t>
       </w:r>
@@ -10688,8 +10638,8 @@
       <w:pPr>
         <w:pStyle w:val="63"/>
       </w:pPr>
-      <w:bookmarkStart w:id="29" w:name="_Toc83812946"/>
-      <w:bookmarkStart w:id="30" w:name="_Toc242174925"/>
+      <w:bookmarkStart w:id="29" w:name="_Toc242174925"/>
+      <w:bookmarkStart w:id="30" w:name="_Toc83812946"/>
       <w:r>
         <w:t xml:space="preserve">Tabla </w:t>
       </w:r>
@@ -24349,7 +24299,12 @@
     </w:p>
     <w:p>
       <w:r>
-        <w:t>Para el Sistema “Servicio de Mantenimiento de Vehículos Monster” se ha identificado los siguientes requerimientos no funcionales en relación con la tecnología de la información.</w:t>
+        <w:t>Para el Sistema “Conversión de Unidades Monster</w:t>
+      </w:r>
+      <w:bookmarkStart w:id="137" w:name="_GoBack"/>
+      <w:bookmarkEnd w:id="137"/>
+      <w:r>
+        <w:t>” se ha identificado los siguientes requerimientos no funcionales en relación con la tecnología de la información.</w:t>
       </w:r>
     </w:p>
     <w:p>
@@ -27220,8 +27175,8 @@
       </w:pPr>
       <w:bookmarkStart w:id="111" w:name="_2xcytpi"/>
       <w:bookmarkEnd w:id="111"/>
-      <w:bookmarkStart w:id="112" w:name="_Toc58077511"/>
-      <w:bookmarkStart w:id="113" w:name="_Toc6761"/>
+      <w:bookmarkStart w:id="112" w:name="_Toc6761"/>
+      <w:bookmarkStart w:id="113" w:name="_Toc58077511"/>
       <w:r>
         <w:t>8.4.2 Restricciones de Hardware</w:t>
       </w:r>
@@ -27371,9 +27326,9 @@
       <w:pPr>
         <w:pStyle w:val="2"/>
       </w:pPr>
-      <w:bookmarkStart w:id="116" w:name="_Toc58077513"/>
-      <w:bookmarkStart w:id="117" w:name="_Toc23846806"/>
-      <w:bookmarkStart w:id="118" w:name="_Toc30382"/>
+      <w:bookmarkStart w:id="116" w:name="_Toc30382"/>
+      <w:bookmarkStart w:id="117" w:name="_Toc58077513"/>
+      <w:bookmarkStart w:id="118" w:name="_Toc23846806"/>
       <w:r>
         <w:t>9. Requisitos de Rendimiento</w:t>
       </w:r>
@@ -27385,9 +27340,9 @@
       <w:pPr>
         <w:pStyle w:val="3"/>
       </w:pPr>
-      <w:bookmarkStart w:id="119" w:name="_Toc58077514"/>
-      <w:bookmarkStart w:id="120" w:name="_Toc23846807"/>
-      <w:bookmarkStart w:id="121" w:name="_Toc4250"/>
+      <w:bookmarkStart w:id="119" w:name="_Toc23846807"/>
+      <w:bookmarkStart w:id="120" w:name="_Toc4250"/>
+      <w:bookmarkStart w:id="121" w:name="_Toc58077514"/>
       <w:r>
         <w:t>9.1. Requisitos de Interfaces Externas</w:t>
       </w:r>
@@ -27399,8 +27354,8 @@
       <w:pPr>
         <w:pStyle w:val="4"/>
       </w:pPr>
-      <w:bookmarkStart w:id="122" w:name="_Toc58077515"/>
-      <w:bookmarkStart w:id="123" w:name="_Toc11260"/>
+      <w:bookmarkStart w:id="122" w:name="_Toc11260"/>
+      <w:bookmarkStart w:id="123" w:name="_Toc58077515"/>
       <w:r>
         <w:t>9.1.1. Interfaces de Usuario</w:t>
       </w:r>
@@ -27708,8 +27663,8 @@
       <w:pPr>
         <w:pStyle w:val="37"/>
       </w:pPr>
-      <w:bookmarkStart w:id="133" w:name="_Toc58077521"/>
-      <w:bookmarkStart w:id="134" w:name="_Toc23713"/>
+      <w:bookmarkStart w:id="133" w:name="_Toc23713"/>
+      <w:bookmarkStart w:id="134" w:name="_Toc58077521"/>
       <w:r>
         <w:t>CONCLUSIONES</w:t>
       </w:r>
@@ -27788,7 +27743,7 @@
     <w:sdtPr>
       <w:id w:val="910883225"/>
       <w:docPartObj>
-        <w:docPartGallery w:val="AutoText"/>
+        <w:docPartGallery w:val="autotext"/>
       </w:docPartObj>
     </w:sdtPr>
     <w:sdtContent>
@@ -29519,7 +29474,7 @@
     <w:lsdException w:qFormat="1" w:unhideWhenUsed="0" w:uiPriority="10" w:semiHidden="0" w:name="Title"/>
     <w:lsdException w:uiPriority="99" w:name="Closing"/>
     <w:lsdException w:uiPriority="99" w:name="Signature"/>
-    <w:lsdException w:uiPriority="1" w:name="Default Paragraph Font"/>
+    <w:lsdException w:qFormat="1" w:uiPriority="1" w:name="Default Paragraph Font"/>
     <w:lsdException w:qFormat="1" w:unhideWhenUsed="0" w:uiPriority="1" w:semiHidden="0" w:name="Body Text"/>
     <w:lsdException w:uiPriority="99" w:name="Body Text Indent"/>
     <w:lsdException w:uiPriority="99" w:name="List Continue"/>
@@ -29557,7 +29512,7 @@
     <w:lsdException w:uiPriority="99" w:name="HTML Sample"/>
     <w:lsdException w:uiPriority="99" w:name="HTML Typewriter"/>
     <w:lsdException w:uiPriority="99" w:name="HTML Variable"/>
-    <w:lsdException w:uiPriority="99" w:name="Normal Table"/>
+    <w:lsdException w:qFormat="1" w:uiPriority="99" w:name="Normal Table"/>
     <w:lsdException w:uiPriority="99" w:name="annotation subject"/>
     <w:lsdException w:uiPriority="99" w:name="Table Simple 1"/>
     <w:lsdException w:uiPriority="99" w:name="Table Simple 2"/>
@@ -29801,12 +29756,14 @@
     <w:name w:val="Default Paragraph Font"/>
     <w:semiHidden/>
     <w:unhideWhenUsed/>
+    <w:qFormat/>
     <w:uiPriority w:val="1"/>
   </w:style>
   <w:style w:type="table" w:default="1" w:styleId="7">
     <w:name w:val="Normal Table"/>
     <w:semiHidden/>
     <w:unhideWhenUsed/>
+    <w:qFormat/>
     <w:uiPriority w:val="99"/>
     <w:tblPr>
       <w:tblCellMar>
@@ -31269,6 +31226,7 @@
   <w:style w:type="table" w:customStyle="1" w:styleId="59">
     <w:name w:val="Grid Table 4 Accent 1"/>
     <w:basedOn w:val="7"/>
+    <w:qFormat/>
     <w:uiPriority w:val="49"/>
     <w:tblPr>
       <w:tblBorders>

</xml_diff>

<commit_message>
fix: Corrección de nombre de IDE netbeans a visual studio
</commit_message>
<xml_diff>
--- a/TI.1.2. PAO202651_SOAP_DOTNET_SINBDD_NRC36884_GR07/01. UML/01. ERS/ERS_SOAP_DOTNET_SINBDD_GR07.docx
+++ b/TI.1.2. PAO202651_SOAP_DOTNET_SINBDD_NRC36884_GR07/01. UML/01. ERS/ERS_SOAP_DOTNET_SINBDD_GR07.docx
@@ -8668,7 +8668,39 @@
         </w:sectPr>
       </w:pPr>
       <w:r>
-        <w:t>El sistema será desarrollado con NetBeans como IDE y sin uso base de datos. La arquitectura es SOA (Service Oriented Architecture) usando Servicios Web SOAP con Dotnet (WCF Core)</w:t>
+        <w:t xml:space="preserve">El sistema será desarrollado con </w:t>
+      </w:r>
+      <w:r>
+        <w:rPr>
+          <w:rFonts w:hint="default"/>
+          <w:lang w:val="es-EC"/>
+        </w:rPr>
+        <w:t>Visual Studio</w:t>
+      </w:r>
+      <w:r>
+        <w:t xml:space="preserve"> como IDE y sin uso base de datos. La arquitectura es SOA (Service Oriented Architecture) usando Servicios Web SOAP con Dotnet (</w:t>
+      </w:r>
+      <w:r>
+        <w:rPr>
+          <w:rFonts w:hint="default"/>
+          <w:lang w:val="es-EC"/>
+        </w:rPr>
+        <w:t xml:space="preserve">.NET </w:t>
+      </w:r>
+      <w:r>
+        <w:t>Core</w:t>
+      </w:r>
+      <w:r>
+        <w:rPr>
+          <w:rFonts w:hint="default"/>
+          <w:lang w:val="es-EC"/>
+        </w:rPr>
+        <w:t xml:space="preserve"> WCF</w:t>
+      </w:r>
+      <w:bookmarkStart w:id="137" w:name="_GoBack"/>
+      <w:bookmarkEnd w:id="137"/>
+      <w:r>
+        <w:t>)</w:t>
       </w:r>
     </w:p>
     <w:p>
@@ -11576,12 +11608,6 @@
             <w:insideH w:val="single" w:color="95B3D7" w:themeColor="accent1" w:themeTint="99" w:sz="4" w:space="0"/>
             <w:insideV w:val="single" w:color="95B3D7" w:themeColor="accent1" w:themeTint="99" w:sz="4" w:space="0"/>
           </w:tblBorders>
-          <w:tblCellMar>
-            <w:top w:w="0" w:type="dxa"/>
-            <w:left w:w="108" w:type="dxa"/>
-            <w:bottom w:w="0" w:type="dxa"/>
-            <w:right w:w="108" w:type="dxa"/>
-          </w:tblCellMar>
         </w:tblPrEx>
         <w:tc>
           <w:tcPr>
@@ -15962,8 +15988,8 @@
       <w:pPr>
         <w:pStyle w:val="63"/>
       </w:pPr>
-      <w:bookmarkStart w:id="72" w:name="_Toc242174931"/>
-      <w:bookmarkStart w:id="73" w:name="_Toc83812961"/>
+      <w:bookmarkStart w:id="72" w:name="_Toc83812961"/>
+      <w:bookmarkStart w:id="73" w:name="_Toc242174931"/>
       <w:r>
         <w:t xml:space="preserve">Tabla </w:t>
       </w:r>
@@ -24299,12 +24325,7 @@
     </w:p>
     <w:p>
       <w:r>
-        <w:t>Para el Sistema “Conversión de Unidades Monster</w:t>
-      </w:r>
-      <w:bookmarkStart w:id="137" w:name="_GoBack"/>
-      <w:bookmarkEnd w:id="137"/>
-      <w:r>
-        <w:t>” se ha identificado los siguientes requerimientos no funcionales en relación con la tecnología de la información.</w:t>
+        <w:t>Para el Sistema “Conversión de Unidades Monster” se ha identificado los siguientes requerimientos no funcionales en relación con la tecnología de la información.</w:t>
       </w:r>
     </w:p>
     <w:p>
@@ -27175,8 +27196,8 @@
       </w:pPr>
       <w:bookmarkStart w:id="111" w:name="_2xcytpi"/>
       <w:bookmarkEnd w:id="111"/>
-      <w:bookmarkStart w:id="112" w:name="_Toc6761"/>
-      <w:bookmarkStart w:id="113" w:name="_Toc58077511"/>
+      <w:bookmarkStart w:id="112" w:name="_Toc58077511"/>
+      <w:bookmarkStart w:id="113" w:name="_Toc6761"/>
       <w:r>
         <w:t>8.4.2 Restricciones de Hardware</w:t>
       </w:r>
@@ -27326,9 +27347,9 @@
       <w:pPr>
         <w:pStyle w:val="2"/>
       </w:pPr>
-      <w:bookmarkStart w:id="116" w:name="_Toc30382"/>
-      <w:bookmarkStart w:id="117" w:name="_Toc58077513"/>
-      <w:bookmarkStart w:id="118" w:name="_Toc23846806"/>
+      <w:bookmarkStart w:id="116" w:name="_Toc23846806"/>
+      <w:bookmarkStart w:id="117" w:name="_Toc30382"/>
+      <w:bookmarkStart w:id="118" w:name="_Toc58077513"/>
       <w:r>
         <w:t>9. Requisitos de Rendimiento</w:t>
       </w:r>
@@ -27340,9 +27361,9 @@
       <w:pPr>
         <w:pStyle w:val="3"/>
       </w:pPr>
-      <w:bookmarkStart w:id="119" w:name="_Toc23846807"/>
-      <w:bookmarkStart w:id="120" w:name="_Toc4250"/>
-      <w:bookmarkStart w:id="121" w:name="_Toc58077514"/>
+      <w:bookmarkStart w:id="119" w:name="_Toc58077514"/>
+      <w:bookmarkStart w:id="120" w:name="_Toc23846807"/>
+      <w:bookmarkStart w:id="121" w:name="_Toc4250"/>
       <w:r>
         <w:t>9.1. Requisitos de Interfaces Externas</w:t>
       </w:r>
@@ -27553,8 +27574,8 @@
       <w:pPr>
         <w:pStyle w:val="4"/>
       </w:pPr>
-      <w:bookmarkStart w:id="126" w:name="_Toc58077517"/>
-      <w:bookmarkStart w:id="127" w:name="_Toc32272"/>
+      <w:bookmarkStart w:id="126" w:name="_Toc32272"/>
+      <w:bookmarkStart w:id="127" w:name="_Toc58077517"/>
       <w:r>
         <w:t>9.1.3. Interfaces de Software</w:t>
       </w:r>
@@ -27589,8 +27610,8 @@
       <w:pPr>
         <w:pStyle w:val="4"/>
       </w:pPr>
-      <w:bookmarkStart w:id="128" w:name="_Toc58077518"/>
-      <w:bookmarkStart w:id="129" w:name="_Toc1799"/>
+      <w:bookmarkStart w:id="128" w:name="_Toc1799"/>
+      <w:bookmarkStart w:id="129" w:name="_Toc58077518"/>
       <w:r>
         <w:t>9.1.4. Interfaces de Comunicación</w:t>
       </w:r>
@@ -27627,8 +27648,8 @@
       <w:pPr>
         <w:pStyle w:val="37"/>
       </w:pPr>
-      <w:bookmarkStart w:id="131" w:name="_Toc58077520"/>
-      <w:bookmarkStart w:id="132" w:name="_Toc20034"/>
+      <w:bookmarkStart w:id="131" w:name="_Toc20034"/>
+      <w:bookmarkStart w:id="132" w:name="_Toc58077520"/>
       <w:r>
         <w:t>RECOMENDACIONES</w:t>
       </w:r>
@@ -27663,8 +27684,8 @@
       <w:pPr>
         <w:pStyle w:val="37"/>
       </w:pPr>
-      <w:bookmarkStart w:id="133" w:name="_Toc23713"/>
-      <w:bookmarkStart w:id="134" w:name="_Toc58077521"/>
+      <w:bookmarkStart w:id="133" w:name="_Toc58077521"/>
+      <w:bookmarkStart w:id="134" w:name="_Toc23713"/>
       <w:r>
         <w:t>CONCLUSIONES</w:t>
       </w:r>
@@ -29438,20 +29459,20 @@
     <w:lsdException w:qFormat="1" w:uiPriority="39" w:semiHidden="0" w:name="toc 8"/>
     <w:lsdException w:qFormat="1" w:uiPriority="39" w:semiHidden="0" w:name="toc 9"/>
     <w:lsdException w:uiPriority="99" w:name="Normal Indent"/>
-    <w:lsdException w:uiPriority="99" w:name="footnote text"/>
+    <w:lsdException w:qFormat="1" w:uiPriority="99" w:name="footnote text"/>
     <w:lsdException w:uiPriority="99" w:name="annotation text"/>
     <w:lsdException w:qFormat="1" w:uiPriority="99" w:semiHidden="0" w:name="header"/>
     <w:lsdException w:qFormat="1" w:uiPriority="99" w:semiHidden="0" w:name="footer"/>
     <w:lsdException w:uiPriority="99" w:name="index heading"/>
     <w:lsdException w:qFormat="1" w:uiPriority="35" w:semiHidden="0" w:name="caption"/>
-    <w:lsdException w:uiPriority="99" w:semiHidden="0" w:name="table of figures"/>
+    <w:lsdException w:qFormat="1" w:uiPriority="99" w:semiHidden="0" w:name="table of figures"/>
     <w:lsdException w:uiPriority="99" w:name="envelope address"/>
     <w:lsdException w:uiPriority="99" w:name="envelope return"/>
     <w:lsdException w:qFormat="1" w:uiPriority="99" w:name="footnote reference"/>
     <w:lsdException w:uiPriority="99" w:name="annotation reference"/>
     <w:lsdException w:uiPriority="99" w:name="line number"/>
     <w:lsdException w:uiPriority="99" w:name="page number"/>
-    <w:lsdException w:uiPriority="99" w:name="endnote reference"/>
+    <w:lsdException w:qFormat="1" w:uiPriority="99" w:name="endnote reference"/>
     <w:lsdException w:qFormat="1" w:uiPriority="99" w:name="endnote text"/>
     <w:lsdException w:uiPriority="99" w:name="table of authorities"/>
     <w:lsdException w:uiPriority="99" w:name="macro"/>
@@ -29584,7 +29605,7 @@
     <w:lsdException w:unhideWhenUsed="0" w:uiPriority="66" w:semiHidden="0" w:name="Medium List 2 Accent 1"/>
     <w:lsdException w:unhideWhenUsed="0" w:uiPriority="67" w:semiHidden="0" w:name="Medium Grid 1 Accent 1"/>
     <w:lsdException w:unhideWhenUsed="0" w:uiPriority="68" w:semiHidden="0" w:name="Medium Grid 2 Accent 1"/>
-    <w:lsdException w:uiPriority="69" w:semiHidden="0" w:name="Medium Grid 3 Accent 1"/>
+    <w:lsdException w:qFormat="1" w:uiPriority="69" w:semiHidden="0" w:name="Medium Grid 3 Accent 1"/>
     <w:lsdException w:unhideWhenUsed="0" w:uiPriority="70" w:semiHidden="0" w:name="Dark List Accent 1"/>
     <w:lsdException w:unhideWhenUsed="0" w:uiPriority="71" w:semiHidden="0" w:name="Colorful Shading Accent 1"/>
     <w:lsdException w:unhideWhenUsed="0" w:uiPriority="72" w:semiHidden="0" w:name="Colorful List Accent 1"/>
@@ -29812,6 +29833,7 @@
     <w:basedOn w:val="6"/>
     <w:semiHidden/>
     <w:unhideWhenUsed/>
+    <w:qFormat/>
     <w:uiPriority w:val="99"/>
     <w:rPr>
       <w:vertAlign w:val="superscript"/>
@@ -29861,6 +29883,7 @@
     <w:link w:val="47"/>
     <w:semiHidden/>
     <w:unhideWhenUsed/>
+    <w:qFormat/>
     <w:uiPriority w:val="99"/>
     <w:rPr>
       <w:sz w:val="20"/>
@@ -29923,6 +29946,7 @@
     <w:basedOn w:val="1"/>
     <w:next w:val="1"/>
     <w:unhideWhenUsed/>
+    <w:qFormat/>
     <w:uiPriority w:val="99"/>
   </w:style>
   <w:style w:type="paragraph" w:styleId="20">
@@ -30105,6 +30129,7 @@
     <w:name w:val="Medium Grid 3 Accent 1"/>
     <w:basedOn w:val="7"/>
     <w:unhideWhenUsed/>
+    <w:qFormat/>
     <w:uiPriority w:val="69"/>
     <w:pPr>
       <w:suppressAutoHyphens/>
@@ -30896,6 +30921,7 @@
   <w:style w:type="table" w:customStyle="1" w:styleId="54">
     <w:name w:val="List Table 3 Accent 4"/>
     <w:basedOn w:val="7"/>
+    <w:qFormat/>
     <w:uiPriority w:val="48"/>
     <w:tblPr>
       <w:tblBorders>
@@ -31327,6 +31353,7 @@
     <w:name w:val="Ilustraciones Char"/>
     <w:basedOn w:val="61"/>
     <w:link w:val="60"/>
+    <w:qFormat/>
     <w:uiPriority w:val="0"/>
     <w:rPr>
       <w:rFonts w:ascii="Calibri" w:hAnsi="Calibri" w:eastAsia="Carlito" w:cs="Carlito"/>

</xml_diff>